<commit_message>
feat(auth): implement user registration API
</commit_message>
<xml_diff>
--- a/TaiLieuMoTa.docx
+++ b/TaiLieuMoTa.docx
@@ -1477,13 +1477,945 @@
     </w:p>
     <w:p>
       <w:pPr>
-        <w:spacing w:after="0"/>
-        <w:rPr>
-          <w:rFonts w:asciiTheme="majorHAnsi" w:hAnsiTheme="majorHAnsi" w:cstheme="majorHAnsi"/>
-          <w:sz w:val="26"/>
-          <w:szCs w:val="26"/>
-        </w:rPr>
-      </w:pPr>
+        <w:rPr>
+          <w:rFonts w:asciiTheme="majorHAnsi" w:hAnsiTheme="majorHAnsi" w:cstheme="majorHAnsi"/>
+          <w:sz w:val="26"/>
+          <w:szCs w:val="26"/>
+        </w:rPr>
+      </w:pPr>
+      <w:r>
+        <w:rPr>
+          <w:rFonts w:asciiTheme="majorHAnsi" w:hAnsiTheme="majorHAnsi" w:cstheme="majorHAnsi"/>
+          <w:sz w:val="26"/>
+          <w:szCs w:val="26"/>
+        </w:rPr>
+        <w:br w:type="page"/>
+      </w:r>
+    </w:p>
+    <w:p>
+      <w:pPr>
+        <w:spacing w:after="0"/>
+        <w:rPr>
+          <w:rFonts w:asciiTheme="majorHAnsi" w:hAnsiTheme="majorHAnsi" w:cstheme="majorHAnsi"/>
+          <w:sz w:val="26"/>
+          <w:szCs w:val="26"/>
+        </w:rPr>
+      </w:pPr>
+      <w:r>
+        <w:rPr>
+          <w:rFonts w:asciiTheme="majorHAnsi" w:hAnsiTheme="majorHAnsi" w:cstheme="majorHAnsi"/>
+          <w:sz w:val="26"/>
+          <w:szCs w:val="26"/>
+        </w:rPr>
+        <w:lastRenderedPageBreak/>
+        <w:t>src/main/java/com/hoanglong/healthcare_connect</w:t>
+      </w:r>
+    </w:p>
+    <w:p>
+      <w:pPr>
+        <w:spacing w:after="0"/>
+        <w:rPr>
+          <w:rFonts w:asciiTheme="majorHAnsi" w:hAnsiTheme="majorHAnsi" w:cstheme="majorHAnsi"/>
+          <w:sz w:val="26"/>
+          <w:szCs w:val="26"/>
+        </w:rPr>
+      </w:pPr>
+      <w:r>
+        <w:rPr>
+          <w:rFonts w:asciiTheme="majorHAnsi" w:hAnsiTheme="majorHAnsi" w:cstheme="majorHAnsi"/>
+          <w:sz w:val="26"/>
+          <w:szCs w:val="26"/>
+        </w:rPr>
+        <w:t>│</w:t>
+      </w:r>
+    </w:p>
+    <w:p>
+      <w:pPr>
+        <w:spacing w:after="0"/>
+        <w:rPr>
+          <w:rFonts w:asciiTheme="majorHAnsi" w:hAnsiTheme="majorHAnsi" w:cstheme="majorHAnsi"/>
+          <w:sz w:val="26"/>
+          <w:szCs w:val="26"/>
+        </w:rPr>
+      </w:pPr>
+      <w:r>
+        <w:rPr>
+          <w:rFonts w:asciiTheme="majorHAnsi" w:hAnsiTheme="majorHAnsi" w:cstheme="majorHAnsi"/>
+          <w:sz w:val="26"/>
+          <w:szCs w:val="26"/>
+        </w:rPr>
+        <w:t xml:space="preserve">├── </w:t>
+      </w:r>
+      <w:r>
+        <w:rPr>
+          <w:rFonts w:ascii="Segoe UI Emoji" w:hAnsi="Segoe UI Emoji" w:cs="Segoe UI Emoji"/>
+          <w:sz w:val="26"/>
+          <w:szCs w:val="26"/>
+        </w:rPr>
+        <w:t>📂</w:t>
+      </w:r>
+      <w:r>
+        <w:rPr>
+          <w:rFonts w:asciiTheme="majorHAnsi" w:hAnsiTheme="majorHAnsi" w:cstheme="majorHAnsi"/>
+          <w:sz w:val="26"/>
+          <w:szCs w:val="26"/>
+        </w:rPr>
+        <w:t xml:space="preserve"> api (Presentation Layer)</w:t>
+      </w:r>
+    </w:p>
+    <w:p>
+      <w:pPr>
+        <w:spacing w:after="0"/>
+        <w:rPr>
+          <w:rFonts w:asciiTheme="majorHAnsi" w:hAnsiTheme="majorHAnsi" w:cstheme="majorHAnsi"/>
+          <w:sz w:val="26"/>
+          <w:szCs w:val="26"/>
+        </w:rPr>
+      </w:pPr>
+      <w:r>
+        <w:rPr>
+          <w:rFonts w:asciiTheme="majorHAnsi" w:hAnsiTheme="majorHAnsi" w:cstheme="majorHAnsi"/>
+          <w:sz w:val="26"/>
+          <w:szCs w:val="26"/>
+        </w:rPr>
+        <w:t xml:space="preserve">│   ├── </w:t>
+      </w:r>
+      <w:r>
+        <w:rPr>
+          <w:rFonts w:ascii="Segoe UI Emoji" w:hAnsi="Segoe UI Emoji" w:cs="Segoe UI Emoji"/>
+          <w:sz w:val="26"/>
+          <w:szCs w:val="26"/>
+        </w:rPr>
+        <w:t>📂</w:t>
+      </w:r>
+      <w:r>
+        <w:rPr>
+          <w:rFonts w:asciiTheme="majorHAnsi" w:hAnsiTheme="majorHAnsi" w:cstheme="majorHAnsi"/>
+          <w:sz w:val="26"/>
+          <w:szCs w:val="26"/>
+        </w:rPr>
+        <w:t xml:space="preserve"> controller          # Các lớp nhận Request (DoctorController, PatientController)</w:t>
+      </w:r>
+    </w:p>
+    <w:p>
+      <w:pPr>
+        <w:spacing w:after="0"/>
+        <w:rPr>
+          <w:rFonts w:asciiTheme="majorHAnsi" w:hAnsiTheme="majorHAnsi" w:cstheme="majorHAnsi"/>
+          <w:sz w:val="26"/>
+          <w:szCs w:val="26"/>
+        </w:rPr>
+      </w:pPr>
+      <w:r>
+        <w:rPr>
+          <w:rFonts w:asciiTheme="majorHAnsi" w:hAnsiTheme="majorHAnsi" w:cstheme="majorHAnsi"/>
+          <w:sz w:val="26"/>
+          <w:szCs w:val="26"/>
+        </w:rPr>
+        <w:t xml:space="preserve">│   ├── </w:t>
+      </w:r>
+      <w:r>
+        <w:rPr>
+          <w:rFonts w:ascii="Segoe UI Emoji" w:hAnsi="Segoe UI Emoji" w:cs="Segoe UI Emoji"/>
+          <w:sz w:val="26"/>
+          <w:szCs w:val="26"/>
+        </w:rPr>
+        <w:t>📂</w:t>
+      </w:r>
+      <w:r>
+        <w:rPr>
+          <w:rFonts w:asciiTheme="majorHAnsi" w:hAnsiTheme="majorHAnsi" w:cstheme="majorHAnsi"/>
+          <w:sz w:val="26"/>
+          <w:szCs w:val="26"/>
+        </w:rPr>
+        <w:t xml:space="preserve"> exception           # GlobalExceptionHandler (Xử lý lỗi tập trung)</w:t>
+      </w:r>
+    </w:p>
+    <w:p>
+      <w:pPr>
+        <w:spacing w:after="0"/>
+        <w:rPr>
+          <w:rFonts w:asciiTheme="majorHAnsi" w:hAnsiTheme="majorHAnsi" w:cstheme="majorHAnsi"/>
+          <w:sz w:val="26"/>
+          <w:szCs w:val="26"/>
+        </w:rPr>
+      </w:pPr>
+      <w:r>
+        <w:rPr>
+          <w:rFonts w:asciiTheme="majorHAnsi" w:hAnsiTheme="majorHAnsi" w:cstheme="majorHAnsi"/>
+          <w:sz w:val="26"/>
+          <w:szCs w:val="26"/>
+        </w:rPr>
+        <w:t xml:space="preserve">│   ├── </w:t>
+      </w:r>
+      <w:r>
+        <w:rPr>
+          <w:rFonts w:ascii="Segoe UI Emoji" w:hAnsi="Segoe UI Emoji" w:cs="Segoe UI Emoji"/>
+          <w:sz w:val="26"/>
+          <w:szCs w:val="26"/>
+        </w:rPr>
+        <w:t>📂</w:t>
+      </w:r>
+      <w:r>
+        <w:rPr>
+          <w:rFonts w:asciiTheme="majorHAnsi" w:hAnsiTheme="majorHAnsi" w:cstheme="majorHAnsi"/>
+          <w:sz w:val="26"/>
+          <w:szCs w:val="26"/>
+        </w:rPr>
+        <w:t xml:space="preserve"> payload             # Request/Response chung (The Envelope Pattern)</w:t>
+      </w:r>
+    </w:p>
+    <w:p>
+      <w:pPr>
+        <w:spacing w:after="0"/>
+        <w:rPr>
+          <w:rFonts w:asciiTheme="majorHAnsi" w:hAnsiTheme="majorHAnsi" w:cstheme="majorHAnsi"/>
+          <w:sz w:val="26"/>
+          <w:szCs w:val="26"/>
+        </w:rPr>
+      </w:pPr>
+      <w:r>
+        <w:rPr>
+          <w:rFonts w:asciiTheme="majorHAnsi" w:hAnsiTheme="majorHAnsi" w:cstheme="majorHAnsi"/>
+          <w:sz w:val="26"/>
+          <w:szCs w:val="26"/>
+        </w:rPr>
+        <w:t xml:space="preserve">│   │   ├── </w:t>
+      </w:r>
+      <w:r>
+        <w:rPr>
+          <w:rFonts w:ascii="Segoe UI Emoji" w:hAnsi="Segoe UI Emoji" w:cs="Segoe UI Emoji"/>
+          <w:sz w:val="26"/>
+          <w:szCs w:val="26"/>
+        </w:rPr>
+        <w:t>📄</w:t>
+      </w:r>
+      <w:r>
+        <w:rPr>
+          <w:rFonts w:asciiTheme="majorHAnsi" w:hAnsiTheme="majorHAnsi" w:cstheme="majorHAnsi"/>
+          <w:sz w:val="26"/>
+          <w:szCs w:val="26"/>
+        </w:rPr>
+        <w:t xml:space="preserve"> ApiResponse.java</w:t>
+      </w:r>
+    </w:p>
+    <w:p>
+      <w:pPr>
+        <w:spacing w:after="0"/>
+        <w:rPr>
+          <w:rFonts w:asciiTheme="majorHAnsi" w:hAnsiTheme="majorHAnsi" w:cstheme="majorHAnsi"/>
+          <w:sz w:val="26"/>
+          <w:szCs w:val="26"/>
+        </w:rPr>
+      </w:pPr>
+      <w:r>
+        <w:rPr>
+          <w:rFonts w:asciiTheme="majorHAnsi" w:hAnsiTheme="majorHAnsi" w:cstheme="majorHAnsi"/>
+          <w:sz w:val="26"/>
+          <w:szCs w:val="26"/>
+        </w:rPr>
+        <w:t xml:space="preserve">│   │   └── </w:t>
+      </w:r>
+      <w:r>
+        <w:rPr>
+          <w:rFonts w:ascii="Segoe UI Emoji" w:hAnsi="Segoe UI Emoji" w:cs="Segoe UI Emoji"/>
+          <w:sz w:val="26"/>
+          <w:szCs w:val="26"/>
+        </w:rPr>
+        <w:t>📄</w:t>
+      </w:r>
+      <w:r>
+        <w:rPr>
+          <w:rFonts w:asciiTheme="majorHAnsi" w:hAnsiTheme="majorHAnsi" w:cstheme="majorHAnsi"/>
+          <w:sz w:val="26"/>
+          <w:szCs w:val="26"/>
+        </w:rPr>
+        <w:t xml:space="preserve"> ApiError.java</w:t>
+      </w:r>
+    </w:p>
+    <w:p>
+      <w:pPr>
+        <w:spacing w:after="0"/>
+        <w:rPr>
+          <w:rFonts w:asciiTheme="majorHAnsi" w:hAnsiTheme="majorHAnsi" w:cstheme="majorHAnsi"/>
+          <w:sz w:val="26"/>
+          <w:szCs w:val="26"/>
+        </w:rPr>
+      </w:pPr>
+      <w:r>
+        <w:rPr>
+          <w:rFonts w:asciiTheme="majorHAnsi" w:hAnsiTheme="majorHAnsi" w:cstheme="majorHAnsi"/>
+          <w:sz w:val="26"/>
+          <w:szCs w:val="26"/>
+        </w:rPr>
+        <w:t xml:space="preserve">│   └── </w:t>
+      </w:r>
+      <w:r>
+        <w:rPr>
+          <w:rFonts w:ascii="Segoe UI Emoji" w:hAnsi="Segoe UI Emoji" w:cs="Segoe UI Emoji"/>
+          <w:sz w:val="26"/>
+          <w:szCs w:val="26"/>
+        </w:rPr>
+        <w:t>📂</w:t>
+      </w:r>
+      <w:r>
+        <w:rPr>
+          <w:rFonts w:asciiTheme="majorHAnsi" w:hAnsiTheme="majorHAnsi" w:cstheme="majorHAnsi"/>
+          <w:sz w:val="26"/>
+          <w:szCs w:val="26"/>
+        </w:rPr>
+        <w:t xml:space="preserve"> middleware          # Các Filter xử lý bảo mật, Logging</w:t>
+      </w:r>
+    </w:p>
+    <w:p>
+      <w:pPr>
+        <w:spacing w:after="0"/>
+        <w:rPr>
+          <w:rFonts w:asciiTheme="majorHAnsi" w:hAnsiTheme="majorHAnsi" w:cstheme="majorHAnsi"/>
+          <w:sz w:val="26"/>
+          <w:szCs w:val="26"/>
+        </w:rPr>
+      </w:pPr>
+      <w:r>
+        <w:rPr>
+          <w:rFonts w:asciiTheme="majorHAnsi" w:hAnsiTheme="majorHAnsi" w:cstheme="majorHAnsi"/>
+          <w:sz w:val="26"/>
+          <w:szCs w:val="26"/>
+        </w:rPr>
+        <w:t>│</w:t>
+      </w:r>
+    </w:p>
+    <w:p>
+      <w:pPr>
+        <w:spacing w:after="0"/>
+        <w:rPr>
+          <w:rFonts w:asciiTheme="majorHAnsi" w:hAnsiTheme="majorHAnsi" w:cstheme="majorHAnsi"/>
+          <w:sz w:val="26"/>
+          <w:szCs w:val="26"/>
+        </w:rPr>
+      </w:pPr>
+      <w:r>
+        <w:rPr>
+          <w:rFonts w:asciiTheme="majorHAnsi" w:hAnsiTheme="majorHAnsi" w:cstheme="majorHAnsi"/>
+          <w:sz w:val="26"/>
+          <w:szCs w:val="26"/>
+        </w:rPr>
+        <w:t xml:space="preserve">├── </w:t>
+      </w:r>
+      <w:r>
+        <w:rPr>
+          <w:rFonts w:ascii="Segoe UI Emoji" w:hAnsi="Segoe UI Emoji" w:cs="Segoe UI Emoji"/>
+          <w:sz w:val="26"/>
+          <w:szCs w:val="26"/>
+        </w:rPr>
+        <w:t>📂</w:t>
+      </w:r>
+      <w:r>
+        <w:rPr>
+          <w:rFonts w:asciiTheme="majorHAnsi" w:hAnsiTheme="majorHAnsi" w:cstheme="majorHAnsi"/>
+          <w:sz w:val="26"/>
+          <w:szCs w:val="26"/>
+        </w:rPr>
+        <w:t xml:space="preserve"> application (Application Layer - Business Logic)</w:t>
+      </w:r>
+    </w:p>
+    <w:p>
+      <w:pPr>
+        <w:spacing w:after="0"/>
+        <w:rPr>
+          <w:rFonts w:asciiTheme="majorHAnsi" w:hAnsiTheme="majorHAnsi" w:cstheme="majorHAnsi"/>
+          <w:sz w:val="26"/>
+          <w:szCs w:val="26"/>
+        </w:rPr>
+      </w:pPr>
+      <w:r>
+        <w:rPr>
+          <w:rFonts w:asciiTheme="majorHAnsi" w:hAnsiTheme="majorHAnsi" w:cstheme="majorHAnsi"/>
+          <w:sz w:val="26"/>
+          <w:szCs w:val="26"/>
+        </w:rPr>
+        <w:t xml:space="preserve">│   ├── </w:t>
+      </w:r>
+      <w:r>
+        <w:rPr>
+          <w:rFonts w:ascii="Segoe UI Emoji" w:hAnsi="Segoe UI Emoji" w:cs="Segoe UI Emoji"/>
+          <w:sz w:val="26"/>
+          <w:szCs w:val="26"/>
+        </w:rPr>
+        <w:t>📂</w:t>
+      </w:r>
+      <w:r>
+        <w:rPr>
+          <w:rFonts w:asciiTheme="majorHAnsi" w:hAnsiTheme="majorHAnsi" w:cstheme="majorHAnsi"/>
+          <w:sz w:val="26"/>
+          <w:szCs w:val="26"/>
+        </w:rPr>
+        <w:t xml:space="preserve"> usecase             # Mỗi hành động là 1 file (BookAppointmentUseCase)</w:t>
+      </w:r>
+    </w:p>
+    <w:p>
+      <w:pPr>
+        <w:spacing w:after="0"/>
+        <w:rPr>
+          <w:rFonts w:asciiTheme="majorHAnsi" w:hAnsiTheme="majorHAnsi" w:cstheme="majorHAnsi"/>
+          <w:sz w:val="26"/>
+          <w:szCs w:val="26"/>
+        </w:rPr>
+      </w:pPr>
+      <w:r>
+        <w:rPr>
+          <w:rFonts w:asciiTheme="majorHAnsi" w:hAnsiTheme="majorHAnsi" w:cstheme="majorHAnsi"/>
+          <w:sz w:val="26"/>
+          <w:szCs w:val="26"/>
+        </w:rPr>
+        <w:t xml:space="preserve">│   ├── </w:t>
+      </w:r>
+      <w:r>
+        <w:rPr>
+          <w:rFonts w:ascii="Segoe UI Emoji" w:hAnsi="Segoe UI Emoji" w:cs="Segoe UI Emoji"/>
+          <w:sz w:val="26"/>
+          <w:szCs w:val="26"/>
+        </w:rPr>
+        <w:t>📂</w:t>
+      </w:r>
+      <w:r>
+        <w:rPr>
+          <w:rFonts w:asciiTheme="majorHAnsi" w:hAnsiTheme="majorHAnsi" w:cstheme="majorHAnsi"/>
+          <w:sz w:val="26"/>
+          <w:szCs w:val="26"/>
+        </w:rPr>
+        <w:t xml:space="preserve"> dto                 # Data Transfer Objects (AppointmentDTO, UserDTO)</w:t>
+      </w:r>
+    </w:p>
+    <w:p>
+      <w:pPr>
+        <w:spacing w:after="0"/>
+        <w:rPr>
+          <w:rFonts w:asciiTheme="majorHAnsi" w:hAnsiTheme="majorHAnsi" w:cstheme="majorHAnsi"/>
+          <w:sz w:val="26"/>
+          <w:szCs w:val="26"/>
+        </w:rPr>
+      </w:pPr>
+      <w:r>
+        <w:rPr>
+          <w:rFonts w:asciiTheme="majorHAnsi" w:hAnsiTheme="majorHAnsi" w:cstheme="majorHAnsi"/>
+          <w:sz w:val="26"/>
+          <w:szCs w:val="26"/>
+        </w:rPr>
+        <w:t xml:space="preserve">│   ├── </w:t>
+      </w:r>
+      <w:r>
+        <w:rPr>
+          <w:rFonts w:ascii="Segoe UI Emoji" w:hAnsi="Segoe UI Emoji" w:cs="Segoe UI Emoji"/>
+          <w:sz w:val="26"/>
+          <w:szCs w:val="26"/>
+        </w:rPr>
+        <w:t>📂</w:t>
+      </w:r>
+      <w:r>
+        <w:rPr>
+          <w:rFonts w:asciiTheme="majorHAnsi" w:hAnsiTheme="majorHAnsi" w:cstheme="majorHAnsi"/>
+          <w:sz w:val="26"/>
+          <w:szCs w:val="26"/>
+        </w:rPr>
+        <w:t xml:space="preserve"> mapper              # Chuyển đổi Entity &lt;-&gt; DTO (MapStruct)</w:t>
+      </w:r>
+    </w:p>
+    <w:p>
+      <w:pPr>
+        <w:spacing w:after="0"/>
+        <w:rPr>
+          <w:rFonts w:asciiTheme="majorHAnsi" w:hAnsiTheme="majorHAnsi" w:cstheme="majorHAnsi"/>
+          <w:sz w:val="26"/>
+          <w:szCs w:val="26"/>
+        </w:rPr>
+      </w:pPr>
+      <w:r>
+        <w:rPr>
+          <w:rFonts w:asciiTheme="majorHAnsi" w:hAnsiTheme="majorHAnsi" w:cstheme="majorHAnsi"/>
+          <w:sz w:val="26"/>
+          <w:szCs w:val="26"/>
+        </w:rPr>
+        <w:t xml:space="preserve">│   └── </w:t>
+      </w:r>
+      <w:r>
+        <w:rPr>
+          <w:rFonts w:ascii="Segoe UI Emoji" w:hAnsi="Segoe UI Emoji" w:cs="Segoe UI Emoji"/>
+          <w:sz w:val="26"/>
+          <w:szCs w:val="26"/>
+        </w:rPr>
+        <w:t>📂</w:t>
+      </w:r>
+      <w:r>
+        <w:rPr>
+          <w:rFonts w:asciiTheme="majorHAnsi" w:hAnsiTheme="majorHAnsi" w:cstheme="majorHAnsi"/>
+          <w:sz w:val="26"/>
+          <w:szCs w:val="26"/>
+        </w:rPr>
+        <w:t xml:space="preserve"> service             # Các logic xử lý trung gian</w:t>
+      </w:r>
+    </w:p>
+    <w:p>
+      <w:pPr>
+        <w:spacing w:after="0"/>
+        <w:rPr>
+          <w:rFonts w:asciiTheme="majorHAnsi" w:hAnsiTheme="majorHAnsi" w:cstheme="majorHAnsi"/>
+          <w:sz w:val="26"/>
+          <w:szCs w:val="26"/>
+        </w:rPr>
+      </w:pPr>
+      <w:r>
+        <w:rPr>
+          <w:rFonts w:asciiTheme="majorHAnsi" w:hAnsiTheme="majorHAnsi" w:cstheme="majorHAnsi"/>
+          <w:sz w:val="26"/>
+          <w:szCs w:val="26"/>
+        </w:rPr>
+        <w:t>│</w:t>
+      </w:r>
+    </w:p>
+    <w:p>
+      <w:pPr>
+        <w:spacing w:after="0"/>
+        <w:rPr>
+          <w:rFonts w:asciiTheme="majorHAnsi" w:hAnsiTheme="majorHAnsi" w:cstheme="majorHAnsi"/>
+          <w:sz w:val="26"/>
+          <w:szCs w:val="26"/>
+        </w:rPr>
+      </w:pPr>
+      <w:r>
+        <w:rPr>
+          <w:rFonts w:asciiTheme="majorHAnsi" w:hAnsiTheme="majorHAnsi" w:cstheme="majorHAnsi"/>
+          <w:sz w:val="26"/>
+          <w:szCs w:val="26"/>
+        </w:rPr>
+        <w:t xml:space="preserve">├── </w:t>
+      </w:r>
+      <w:r>
+        <w:rPr>
+          <w:rFonts w:ascii="Segoe UI Emoji" w:hAnsi="Segoe UI Emoji" w:cs="Segoe UI Emoji"/>
+          <w:sz w:val="26"/>
+          <w:szCs w:val="26"/>
+        </w:rPr>
+        <w:t>📂</w:t>
+      </w:r>
+      <w:r>
+        <w:rPr>
+          <w:rFonts w:asciiTheme="majorHAnsi" w:hAnsiTheme="majorHAnsi" w:cstheme="majorHAnsi"/>
+          <w:sz w:val="26"/>
+          <w:szCs w:val="26"/>
+        </w:rPr>
+        <w:t xml:space="preserve"> core (Domain Layer - Trái tim dự án)</w:t>
+      </w:r>
+    </w:p>
+    <w:p>
+      <w:pPr>
+        <w:spacing w:after="0"/>
+        <w:rPr>
+          <w:rFonts w:asciiTheme="majorHAnsi" w:hAnsiTheme="majorHAnsi" w:cstheme="majorHAnsi"/>
+          <w:sz w:val="26"/>
+          <w:szCs w:val="26"/>
+        </w:rPr>
+      </w:pPr>
+      <w:r>
+        <w:rPr>
+          <w:rFonts w:asciiTheme="majorHAnsi" w:hAnsiTheme="majorHAnsi" w:cstheme="majorHAnsi"/>
+          <w:sz w:val="26"/>
+          <w:szCs w:val="26"/>
+        </w:rPr>
+        <w:t xml:space="preserve">│   ├── </w:t>
+      </w:r>
+      <w:r>
+        <w:rPr>
+          <w:rFonts w:ascii="Segoe UI Emoji" w:hAnsi="Segoe UI Emoji" w:cs="Segoe UI Emoji"/>
+          <w:sz w:val="26"/>
+          <w:szCs w:val="26"/>
+        </w:rPr>
+        <w:t>📂</w:t>
+      </w:r>
+      <w:r>
+        <w:rPr>
+          <w:rFonts w:asciiTheme="majorHAnsi" w:hAnsiTheme="majorHAnsi" w:cstheme="majorHAnsi"/>
+          <w:sz w:val="26"/>
+          <w:szCs w:val="26"/>
+        </w:rPr>
+        <w:t xml:space="preserve"> entity              # Đối tượng nghiệp vụ (User, Appointment, MedicalRecord)</w:t>
+      </w:r>
+    </w:p>
+    <w:p>
+      <w:pPr>
+        <w:spacing w:after="0"/>
+        <w:rPr>
+          <w:rFonts w:asciiTheme="majorHAnsi" w:hAnsiTheme="majorHAnsi" w:cstheme="majorHAnsi"/>
+          <w:sz w:val="26"/>
+          <w:szCs w:val="26"/>
+        </w:rPr>
+      </w:pPr>
+      <w:r>
+        <w:rPr>
+          <w:rFonts w:asciiTheme="majorHAnsi" w:hAnsiTheme="majorHAnsi" w:cstheme="majorHAnsi"/>
+          <w:sz w:val="26"/>
+          <w:szCs w:val="26"/>
+        </w:rPr>
+        <w:t xml:space="preserve">│   ├── </w:t>
+      </w:r>
+      <w:r>
+        <w:rPr>
+          <w:rFonts w:ascii="Segoe UI Emoji" w:hAnsi="Segoe UI Emoji" w:cs="Segoe UI Emoji"/>
+          <w:sz w:val="26"/>
+          <w:szCs w:val="26"/>
+        </w:rPr>
+        <w:t>📂</w:t>
+      </w:r>
+      <w:r>
+        <w:rPr>
+          <w:rFonts w:asciiTheme="majorHAnsi" w:hAnsiTheme="majorHAnsi" w:cstheme="majorHAnsi"/>
+          <w:sz w:val="26"/>
+          <w:szCs w:val="26"/>
+        </w:rPr>
+        <w:t xml:space="preserve"> repository          # Interface định nghĩa (IUserRepository, IAppointmentRepository)</w:t>
+      </w:r>
+    </w:p>
+    <w:p>
+      <w:pPr>
+        <w:spacing w:after="0"/>
+        <w:rPr>
+          <w:rFonts w:asciiTheme="majorHAnsi" w:hAnsiTheme="majorHAnsi" w:cstheme="majorHAnsi"/>
+          <w:sz w:val="26"/>
+          <w:szCs w:val="26"/>
+        </w:rPr>
+      </w:pPr>
+      <w:r>
+        <w:rPr>
+          <w:rFonts w:asciiTheme="majorHAnsi" w:hAnsiTheme="majorHAnsi" w:cstheme="majorHAnsi"/>
+          <w:sz w:val="26"/>
+          <w:szCs w:val="26"/>
+        </w:rPr>
+        <w:t xml:space="preserve">│   ├── </w:t>
+      </w:r>
+      <w:r>
+        <w:rPr>
+          <w:rFonts w:ascii="Segoe UI Emoji" w:hAnsi="Segoe UI Emoji" w:cs="Segoe UI Emoji"/>
+          <w:sz w:val="26"/>
+          <w:szCs w:val="26"/>
+        </w:rPr>
+        <w:t>📂</w:t>
+      </w:r>
+      <w:r>
+        <w:rPr>
+          <w:rFonts w:asciiTheme="majorHAnsi" w:hAnsiTheme="majorHAnsi" w:cstheme="majorHAnsi"/>
+          <w:sz w:val="26"/>
+          <w:szCs w:val="26"/>
+        </w:rPr>
+        <w:t xml:space="preserve"> exception           # Lỗi nghiệp vụ (DomainException)</w:t>
+      </w:r>
+    </w:p>
+    <w:p>
+      <w:pPr>
+        <w:spacing w:after="0"/>
+        <w:rPr>
+          <w:rFonts w:asciiTheme="majorHAnsi" w:hAnsiTheme="majorHAnsi" w:cstheme="majorHAnsi"/>
+          <w:sz w:val="26"/>
+          <w:szCs w:val="26"/>
+        </w:rPr>
+      </w:pPr>
+      <w:r>
+        <w:rPr>
+          <w:rFonts w:asciiTheme="majorHAnsi" w:hAnsiTheme="majorHAnsi" w:cstheme="majorHAnsi"/>
+          <w:sz w:val="26"/>
+          <w:szCs w:val="26"/>
+        </w:rPr>
+        <w:t xml:space="preserve">│   └── </w:t>
+      </w:r>
+      <w:r>
+        <w:rPr>
+          <w:rFonts w:ascii="Segoe UI Emoji" w:hAnsi="Segoe UI Emoji" w:cs="Segoe UI Emoji"/>
+          <w:sz w:val="26"/>
+          <w:szCs w:val="26"/>
+        </w:rPr>
+        <w:t>📂</w:t>
+      </w:r>
+      <w:r>
+        <w:rPr>
+          <w:rFonts w:asciiTheme="majorHAnsi" w:hAnsiTheme="majorHAnsi" w:cstheme="majorHAnsi"/>
+          <w:sz w:val="26"/>
+          <w:szCs w:val="26"/>
+        </w:rPr>
+        <w:t xml:space="preserve"> constant            # Các Enum, Constant (AppointmentStatus, UserRole)</w:t>
+      </w:r>
+    </w:p>
+    <w:p>
+      <w:pPr>
+        <w:spacing w:after="0"/>
+        <w:rPr>
+          <w:rFonts w:asciiTheme="majorHAnsi" w:hAnsiTheme="majorHAnsi" w:cstheme="majorHAnsi"/>
+          <w:sz w:val="26"/>
+          <w:szCs w:val="26"/>
+        </w:rPr>
+      </w:pPr>
+      <w:r>
+        <w:rPr>
+          <w:rFonts w:asciiTheme="majorHAnsi" w:hAnsiTheme="majorHAnsi" w:cstheme="majorHAnsi"/>
+          <w:sz w:val="26"/>
+          <w:szCs w:val="26"/>
+        </w:rPr>
+        <w:t>│</w:t>
+      </w:r>
+    </w:p>
+    <w:p>
+      <w:pPr>
+        <w:spacing w:after="0"/>
+        <w:rPr>
+          <w:rFonts w:asciiTheme="majorHAnsi" w:hAnsiTheme="majorHAnsi" w:cstheme="majorHAnsi"/>
+          <w:sz w:val="26"/>
+          <w:szCs w:val="26"/>
+        </w:rPr>
+      </w:pPr>
+      <w:r>
+        <w:rPr>
+          <w:rFonts w:asciiTheme="majorHAnsi" w:hAnsiTheme="majorHAnsi" w:cstheme="majorHAnsi"/>
+          <w:sz w:val="26"/>
+          <w:szCs w:val="26"/>
+        </w:rPr>
+        <w:t xml:space="preserve">├── </w:t>
+      </w:r>
+      <w:r>
+        <w:rPr>
+          <w:rFonts w:ascii="Segoe UI Emoji" w:hAnsi="Segoe UI Emoji" w:cs="Segoe UI Emoji"/>
+          <w:sz w:val="26"/>
+          <w:szCs w:val="26"/>
+        </w:rPr>
+        <w:t>📂</w:t>
+      </w:r>
+      <w:r>
+        <w:rPr>
+          <w:rFonts w:asciiTheme="majorHAnsi" w:hAnsiTheme="majorHAnsi" w:cstheme="majorHAnsi"/>
+          <w:sz w:val="26"/>
+          <w:szCs w:val="26"/>
+        </w:rPr>
+        <w:t xml:space="preserve"> infrastructure (Infrastructure Layer - Chi tiết thực thi)</w:t>
+      </w:r>
+    </w:p>
+    <w:p>
+      <w:pPr>
+        <w:spacing w:after="0"/>
+        <w:rPr>
+          <w:rFonts w:asciiTheme="majorHAnsi" w:hAnsiTheme="majorHAnsi" w:cstheme="majorHAnsi"/>
+          <w:sz w:val="26"/>
+          <w:szCs w:val="26"/>
+        </w:rPr>
+      </w:pPr>
+      <w:r>
+        <w:rPr>
+          <w:rFonts w:asciiTheme="majorHAnsi" w:hAnsiTheme="majorHAnsi" w:cstheme="majorHAnsi"/>
+          <w:sz w:val="26"/>
+          <w:szCs w:val="26"/>
+        </w:rPr>
+        <w:t xml:space="preserve">│   ├── </w:t>
+      </w:r>
+      <w:r>
+        <w:rPr>
+          <w:rFonts w:ascii="Segoe UI Emoji" w:hAnsi="Segoe UI Emoji" w:cs="Segoe UI Emoji"/>
+          <w:sz w:val="26"/>
+          <w:szCs w:val="26"/>
+        </w:rPr>
+        <w:t>📂</w:t>
+      </w:r>
+      <w:r>
+        <w:rPr>
+          <w:rFonts w:asciiTheme="majorHAnsi" w:hAnsiTheme="majorHAnsi" w:cstheme="majorHAnsi"/>
+          <w:sz w:val="26"/>
+          <w:szCs w:val="26"/>
+        </w:rPr>
+        <w:t xml:space="preserve"> persistence         # Cài đặt Repository (Spring Data JPA)</w:t>
+      </w:r>
+    </w:p>
+    <w:p>
+      <w:pPr>
+        <w:spacing w:after="0"/>
+        <w:rPr>
+          <w:rFonts w:asciiTheme="majorHAnsi" w:hAnsiTheme="majorHAnsi" w:cstheme="majorHAnsi"/>
+          <w:sz w:val="26"/>
+          <w:szCs w:val="26"/>
+        </w:rPr>
+      </w:pPr>
+      <w:r>
+        <w:rPr>
+          <w:rFonts w:asciiTheme="majorHAnsi" w:hAnsiTheme="majorHAnsi" w:cstheme="majorHAnsi"/>
+          <w:sz w:val="26"/>
+          <w:szCs w:val="26"/>
+        </w:rPr>
+        <w:t xml:space="preserve">│   ├── </w:t>
+      </w:r>
+      <w:r>
+        <w:rPr>
+          <w:rFonts w:ascii="Segoe UI Emoji" w:hAnsi="Segoe UI Emoji" w:cs="Segoe UI Emoji"/>
+          <w:sz w:val="26"/>
+          <w:szCs w:val="26"/>
+        </w:rPr>
+        <w:t>📂</w:t>
+      </w:r>
+      <w:r>
+        <w:rPr>
+          <w:rFonts w:asciiTheme="majorHAnsi" w:hAnsiTheme="majorHAnsi" w:cstheme="majorHAnsi"/>
+          <w:sz w:val="26"/>
+          <w:szCs w:val="26"/>
+        </w:rPr>
+        <w:t xml:space="preserve"> security            # Cấu hình JWT, OAuth2, Bcrypt</w:t>
+      </w:r>
+    </w:p>
+    <w:p>
+      <w:pPr>
+        <w:spacing w:after="0"/>
+        <w:rPr>
+          <w:rFonts w:asciiTheme="majorHAnsi" w:hAnsiTheme="majorHAnsi" w:cstheme="majorHAnsi"/>
+          <w:sz w:val="26"/>
+          <w:szCs w:val="26"/>
+        </w:rPr>
+      </w:pPr>
+      <w:r>
+        <w:rPr>
+          <w:rFonts w:asciiTheme="majorHAnsi" w:hAnsiTheme="majorHAnsi" w:cstheme="majorHAnsi"/>
+          <w:sz w:val="26"/>
+          <w:szCs w:val="26"/>
+        </w:rPr>
+        <w:t xml:space="preserve">│   ├── </w:t>
+      </w:r>
+      <w:r>
+        <w:rPr>
+          <w:rFonts w:ascii="Segoe UI Emoji" w:hAnsi="Segoe UI Emoji" w:cs="Segoe UI Emoji"/>
+          <w:sz w:val="26"/>
+          <w:szCs w:val="26"/>
+        </w:rPr>
+        <w:t>📂</w:t>
+      </w:r>
+      <w:r>
+        <w:rPr>
+          <w:rFonts w:asciiTheme="majorHAnsi" w:hAnsiTheme="majorHAnsi" w:cstheme="majorHAnsi"/>
+          <w:sz w:val="26"/>
+          <w:szCs w:val="26"/>
+        </w:rPr>
+        <w:t xml:space="preserve"> external_services   # Twilio, SendGrid, Gemini AI implementations</w:t>
+      </w:r>
+    </w:p>
+    <w:p>
+      <w:pPr>
+        <w:spacing w:after="0"/>
+        <w:rPr>
+          <w:rFonts w:asciiTheme="majorHAnsi" w:hAnsiTheme="majorHAnsi" w:cstheme="majorHAnsi"/>
+          <w:sz w:val="26"/>
+          <w:szCs w:val="26"/>
+        </w:rPr>
+      </w:pPr>
+      <w:r>
+        <w:rPr>
+          <w:rFonts w:asciiTheme="majorHAnsi" w:hAnsiTheme="majorHAnsi" w:cstheme="majorHAnsi"/>
+          <w:sz w:val="26"/>
+          <w:szCs w:val="26"/>
+        </w:rPr>
+        <w:t xml:space="preserve">│   └── </w:t>
+      </w:r>
+      <w:r>
+        <w:rPr>
+          <w:rFonts w:ascii="Segoe UI Emoji" w:hAnsi="Segoe UI Emoji" w:cs="Segoe UI Emoji"/>
+          <w:sz w:val="26"/>
+          <w:szCs w:val="26"/>
+        </w:rPr>
+        <w:t>📂</w:t>
+      </w:r>
+      <w:r>
+        <w:rPr>
+          <w:rFonts w:asciiTheme="majorHAnsi" w:hAnsiTheme="majorHAnsi" w:cstheme="majorHAnsi"/>
+          <w:sz w:val="26"/>
+          <w:szCs w:val="26"/>
+        </w:rPr>
+        <w:t xml:space="preserve"> config              # Các file cấu hình Bean (@Configuration)</w:t>
+      </w:r>
+    </w:p>
+    <w:p>
+      <w:pPr>
+        <w:spacing w:after="0"/>
+        <w:rPr>
+          <w:rFonts w:asciiTheme="majorHAnsi" w:hAnsiTheme="majorHAnsi" w:cstheme="majorHAnsi"/>
+          <w:sz w:val="26"/>
+          <w:szCs w:val="26"/>
+        </w:rPr>
+      </w:pPr>
+      <w:r>
+        <w:rPr>
+          <w:rFonts w:asciiTheme="majorHAnsi" w:hAnsiTheme="majorHAnsi" w:cstheme="majorHAnsi"/>
+          <w:sz w:val="26"/>
+          <w:szCs w:val="26"/>
+        </w:rPr>
+        <w:t>│</w:t>
+      </w:r>
+    </w:p>
+    <w:p>
+      <w:pPr>
+        <w:spacing w:after="0"/>
+        <w:rPr>
+          <w:rFonts w:asciiTheme="majorHAnsi" w:hAnsiTheme="majorHAnsi" w:cstheme="majorHAnsi"/>
+          <w:sz w:val="26"/>
+          <w:szCs w:val="26"/>
+        </w:rPr>
+      </w:pPr>
+      <w:r>
+        <w:rPr>
+          <w:rFonts w:asciiTheme="majorHAnsi" w:hAnsiTheme="majorHAnsi" w:cstheme="majorHAnsi"/>
+          <w:sz w:val="26"/>
+          <w:szCs w:val="26"/>
+        </w:rPr>
+        <w:t xml:space="preserve">└── </w:t>
+      </w:r>
+      <w:r>
+        <w:rPr>
+          <w:rFonts w:ascii="Segoe UI Emoji" w:hAnsi="Segoe UI Emoji" w:cs="Segoe UI Emoji"/>
+          <w:sz w:val="26"/>
+          <w:szCs w:val="26"/>
+        </w:rPr>
+        <w:t>📂</w:t>
+      </w:r>
+      <w:r>
+        <w:rPr>
+          <w:rFonts w:asciiTheme="majorHAnsi" w:hAnsiTheme="majorHAnsi" w:cstheme="majorHAnsi"/>
+          <w:sz w:val="26"/>
+          <w:szCs w:val="26"/>
+        </w:rPr>
+        <w:t xml:space="preserve"> shared (Tiện ích dùng chung)</w:t>
+      </w:r>
+    </w:p>
+    <w:p>
+      <w:pPr>
+        <w:spacing w:after="0"/>
+        <w:rPr>
+          <w:rFonts w:asciiTheme="majorHAnsi" w:hAnsiTheme="majorHAnsi" w:cstheme="majorHAnsi"/>
+          <w:sz w:val="26"/>
+          <w:szCs w:val="26"/>
+        </w:rPr>
+      </w:pPr>
+      <w:r>
+        <w:rPr>
+          <w:rFonts w:asciiTheme="majorHAnsi" w:hAnsiTheme="majorHAnsi" w:cstheme="majorHAnsi"/>
+          <w:sz w:val="26"/>
+          <w:szCs w:val="26"/>
+        </w:rPr>
+        <w:t xml:space="preserve">    └── </w:t>
+      </w:r>
+      <w:r>
+        <w:rPr>
+          <w:rFonts w:ascii="Segoe UI Emoji" w:hAnsi="Segoe UI Emoji" w:cs="Segoe UI Emoji"/>
+          <w:sz w:val="26"/>
+          <w:szCs w:val="26"/>
+        </w:rPr>
+        <w:t>📂</w:t>
+      </w:r>
+      <w:r>
+        <w:rPr>
+          <w:rFonts w:asciiTheme="majorHAnsi" w:hAnsiTheme="majorHAnsi" w:cstheme="majorHAnsi"/>
+          <w:sz w:val="26"/>
+          <w:szCs w:val="26"/>
+        </w:rPr>
+        <w:t xml:space="preserve"> util                # StringUtils, DateUtils, PDFGenerator</w:t>
+      </w:r>
     </w:p>
     <w:sectPr>
       <w:pgSz w:w="11906" w:h="16838"/>
@@ -3471,6 +4403,7 @@
   <w:style w:type="character" w:default="1" w:styleId="DefaultParagraphFont">
     <w:name w:val="Default Paragraph Font"/>
     <w:uiPriority w:val="1"/>
+    <w:semiHidden/>
     <w:unhideWhenUsed/>
   </w:style>
   <w:style w:type="table" w:default="1" w:styleId="TableNormal">

</xml_diff>